<commit_message>
Fix unsourced opening claim and reconcile the two utilization stats
Co-Authored-By: Claude Sonnet 5 <noreply@anthropic.com>
</commit_message>
<xml_diff>
--- a/articles/2026-08-01-ai-seats-utilization-problem.docx
+++ b/articles/2026-08-01-ai-seats-utilization-problem.docx
@@ -18,7 +18,7 @@
     </w:p>
     <w:p>
       <w:r>
-        <w:t>Half the staff at a typical AEC or consulting firm never open the AI tool they were given. A smaller group treats the monthly token quota like a scoreboard. Neither number tells a partner whether the work got better.</w:t>
+        <w:t>At a typical company that has bought AI seats, a large share of the people holding one rarely open it, while a smaller group treats the monthly token quota like a scoreboard. Neither number tells a partner whether the work got better.</w:t>
       </w:r>
     </w:p>
     <w:p>
@@ -56,9 +56,26 @@
     </w:p>
     <w:p>
       <w:r>
-        <w:t>Microsoft and LinkedIn's 2024 Work Trend Index found that 78 percent of AI users bring their own AI tools to work rather than wait for an employer rollout, rising to 85 percent among Gen Z employees (</w:t>
+        <w:t xml:space="preserve">A 2026 enterprise adoption analysis by </w:t>
       </w:r>
       <w:hyperlink r:id="rId9">
+        <w:r>
+          <w:rPr>
+            <w:color w:val="0563C1"/>
+            <w:u w:val="single"/>
+          </w:rPr>
+          <w:t>ValueAdd VC</w:t>
+        </w:r>
+      </w:hyperlink>
+      <w:r>
+        <w:t>, citing Gartner and Forrester survey data, puts weekly active use of purchased Copilot seats at 20 to 30 percent, with daily use often under 40 percent even at firms that committed to enterprise wide rollouts. That figure is a secondary compilation rather than a named primary report, so treat the exact percentage as directional, not precise.</w:t>
+      </w:r>
+    </w:p>
+    <w:p>
+      <w:r>
+        <w:t>It matches the general shape of a stronger, primary number. Microsoft and LinkedIn's 2024 Work Trend Index found that 78 percent of AI users bring their own AI tools to work rather than wait for an employer rollout, rising to 85 percent among Gen Z employees (</w:t>
+      </w:r>
+      <w:hyperlink r:id="rId10">
         <w:r>
           <w:rPr>
             <w:color w:val="0563C1"/>
@@ -68,14 +85,14 @@
         </w:r>
       </w:hyperlink>
       <w:r>
-        <w:t>). The tool shows up in a person's workflow long before it shows up on a firm's licensing spreadsheet. By the time the firm buys an official seat, adoption already looks uneven: some people have been running the tool for a year, others are opening it for the first time because IT sent a reminder email.</w:t>
+        <w:t>). Read together, the two studies describe the same uneven start: some staff have been running AI on their own for a year before a firm ever buys them an official seat, and once that seat exists, a large share of the people holding one rarely open it.</w:t>
       </w:r>
     </w:p>
     <w:p>
       <w:r>
         <w:t>The opposite pattern shows up further along the same curve. IntuitionLabs tracked a developer named Harika Yenuga who burned through 200,000 tokens in twenty minutes on a single session, then rebuilt her workflow and cut that consumption by 70 percent once she looked at what the task actually needed (</w:t>
       </w:r>
-      <w:hyperlink r:id="rId10">
+      <w:hyperlink r:id="rId11">
         <w:r>
           <w:rPr>
             <w:color w:val="0563C1"/>
@@ -111,7 +128,7 @@
       <w:r>
         <w:t>Economist Charles Goodhart made the underlying point in 1975, writing about monetary policy: a statistical regularity tends to collapse once it becomes a target of control (</w:t>
       </w:r>
-      <w:hyperlink r:id="rId11">
+      <w:hyperlink r:id="rId12">
         <w:r>
           <w:rPr>
             <w:color w:val="0563C1"/>
@@ -149,7 +166,7 @@
                     <pic:cNvPicPr/>
                   </pic:nvPicPr>
                   <pic:blipFill>
-                    <a:blip r:embed="rId12"/>
+                    <a:blip r:embed="rId13"/>
                     <a:stretch>
                       <a:fillRect/>
                     </a:stretch>

</xml_diff>

<commit_message>
Rewrite shorter with current 2026 data, drop judgmental framing
Co-Authored-By: Claude Sonnet 5 <noreply@anthropic.com>
</commit_message>
<xml_diff>
--- a/articles/2026-08-01-ai-seats-utilization-problem.docx
+++ b/articles/2026-08-01-ai-seats-utilization-problem.docx
@@ -18,7 +18,19 @@
     </w:p>
     <w:p>
       <w:r>
-        <w:t>At a typical company that has bought AI seats, a large share of the people holding one rarely open it, while a smaller group treats the monthly token quota like a scoreboard. Neither number tells a partner whether the work got better.</w:t>
+        <w:t>Two years ago, 32 people at the law firm Ropes &amp; Gray sent a few hundred AI prompts a month. Today, close to 2,200 people at the same firm send more than 282,000 prompts a month, and each user is roughly three times as active as a year earlier (</w:t>
+      </w:r>
+      <w:hyperlink r:id="rId9">
+        <w:r>
+          <w:rPr>
+            <w:color w:val="0563C1"/>
+            <w:u w:val="single"/>
+          </w:rPr>
+          <w:t>Breitbart, citing Wall Street Journal reporting</w:t>
+        </w:r>
+      </w:hyperlink>
+      <w:r>
+        <w:t>). The growth did not come from a mandate. It came from a network of more than 60 internal champions who kept showing colleagues what the tool was actually good for.</w:t>
       </w:r>
     </w:p>
     <w:p>
@@ -37,7 +49,7 @@
     </w:p>
     <w:p>
       <w:r>
-        <w:t>David Maister spent thirty years telling professional service firms the same thing: once utilization covers its cost, more hours logged stop making a firm more profitable, and the only lever left is the value each hour produces. Firms buying AI seats are running the identical trade without knowing it. A seat that gets opened every day is not the same fact as a deliverable that got better, and most firms are only tracking the one that is easy to count.</w:t>
+        <w:t>That curve raises a question every firm now has to answer for itself: whether a rising login or token count means the work got better, or just means more people are busy with the tool. David Maister asked a version of the same question about billable hours thirty years ago. His answer was that once utilization already covers its cost, more hours logged stop making a firm more profitable on their own, and the only lever left is the value each hour produces.</w:t>
       </w:r>
     </w:p>
     <w:p>
@@ -51,29 +63,12 @@
           <w:color w:val="1F3A5F"/>
           <w:sz w:val="30"/>
         </w:rPr>
-        <w:t>What happened</w:t>
+        <w:t>What the data actually shows</w:t>
       </w:r>
     </w:p>
     <w:p>
       <w:r>
-        <w:t xml:space="preserve">A 2026 enterprise adoption analysis by </w:t>
-      </w:r>
-      <w:hyperlink r:id="rId9">
-        <w:r>
-          <w:rPr>
-            <w:color w:val="0563C1"/>
-            <w:u w:val="single"/>
-          </w:rPr>
-          <w:t>ValueAdd VC</w:t>
-        </w:r>
-      </w:hyperlink>
-      <w:r>
-        <w:t>, citing Gartner and Forrester survey data, puts weekly active use of purchased Copilot seats at 20 to 30 percent, with daily use often under 40 percent even at firms that committed to enterprise wide rollouts. That figure is a secondary compilation rather than a named primary report, so treat the exact percentage as directional, not precise.</w:t>
-      </w:r>
-    </w:p>
-    <w:p>
-      <w:r>
-        <w:t>It matches the general shape of a stronger, primary number. Microsoft and LinkedIn's 2024 Work Trend Index found that 78 percent of AI users bring their own AI tools to work rather than wait for an employer rollout, rising to 85 percent among Gen Z employees (</w:t>
+        <w:t>Microsoft's 2026 Work Trend Index splits AI users into three groups rather than a single adoption number: about 19 percent are "Frontier" users with both strong personal skill and real organizational support, 31 percent are held back by unclaimed capacity or organizational blockers, and the remaining half sit in what the report calls an emergent zone, still finding their footing (</w:t>
       </w:r>
       <w:hyperlink r:id="rId10">
         <w:r>
@@ -85,24 +80,12 @@
         </w:r>
       </w:hyperlink>
       <w:r>
-        <w:t>). Read together, the two studies describe the same uneven start: some staff have been running AI on their own for a year before a firm ever buys them an official seat, and once that seat exists, a large share of the people holding one rarely open it.</w:t>
+        <w:t>). The same report finds that organizational factors, culture, manager support, and how work gets structured, account for more than twice the measured impact of individual effort alone.</w:t>
       </w:r>
     </w:p>
     <w:p>
       <w:r>
-        <w:t>The opposite pattern shows up further along the same curve. IntuitionLabs tracked a developer named Harika Yenuga who burned through 200,000 tokens in twenty minutes on a single session, then rebuilt her workflow and cut that consumption by 70 percent once she looked at what the task actually needed (</w:t>
-      </w:r>
-      <w:hyperlink r:id="rId11">
-        <w:r>
-          <w:rPr>
-            <w:color w:val="0563C1"/>
-            <w:u w:val="single"/>
-          </w:rPr>
-          <w:t>IntuitionLabs</w:t>
-        </w:r>
-      </w:hyperlink>
-      <w:r>
-        <w:t>). One group has not started. The other started, found the tool genuinely useful, and kept scaling the same habit past the point where more tokens bought more value.</w:t>
+        <w:t>Ropes &amp; Gray's trajectory fits that pattern rather than contradicting it. Adoption there took two years and a champion network to move from a handful of curious early users to a firm wide daily habit. Nothing in that timeline suggests most firms are behind schedule. It suggests adoption compounds slowly and unevenly, mostly through people convincing other people rather than through a rollout announcement.</w:t>
       </w:r>
     </w:p>
     <w:p>
@@ -116,34 +99,12 @@
           <w:color w:val="1F3A5F"/>
           <w:sz w:val="30"/>
         </w:rPr>
-        <w:t>Why it matters to a firm like yours</w:t>
+        <w:t>Why this is still worth watching</w:t>
       </w:r>
     </w:p>
     <w:p>
       <w:r>
-        <w:t>Treat the firm as a machine: inputs, people, a feedback loop, outputs. The input is a seat, priced the same whether it gets opened once a quarter or runs all day. Maister's own formula for a professional firm's profit runs on margin, rate, utilization, and leverage, and his argument was never that more utilization is automatically good. Past a certain point, activation just tells a partner that people are busy. It does not tell them the firm earns more per hour of that busyness. An AI seat inherits the same ceiling. A high activation number says the tool got opened. Nothing in that number says whether the output needed less editing before a partner could send it, or whether the project shipped with fewer errors. [YOUR DETAIL HERE]</w:t>
-      </w:r>
-    </w:p>
-    <w:p>
-      <w:r>
-        <w:t>Economist Charles Goodhart made the underlying point in 1975, writing about monetary policy: a statistical regularity tends to collapse once it becomes a target of control (</w:t>
-      </w:r>
-      <w:hyperlink r:id="rId12">
-        <w:r>
-          <w:rPr>
-            <w:color w:val="0563C1"/>
-            <w:u w:val="single"/>
-          </w:rPr>
-          <w:t>Goodhart's law</w:t>
-        </w:r>
-      </w:hyperlink>
-      <w:r>
-        <w:t>). The line everyone actually quotes, "when a measure becomes a target, it ceases to be a good measure," was coined later by the anthropologist Marilyn Strathern, not by Goodhart himself, but the mechanism is his. Track seat logins as the success metric, and a firm will get more seat logins. It has no built in reason to also get better work.</w:t>
-      </w:r>
-    </w:p>
-    <w:p>
-      <w:r>
-        <w:t>Cross how often a seat gets opened against whether anyone has checked its output against an outcome, and four situations fall out.</w:t>
+        <w:t>Cross how often a seat gets used against whether anyone has checked its output against an outcome, and four situations fall out, none of them inherently a mistake.</w:t>
       </w:r>
     </w:p>
     <w:p>
@@ -166,7 +127,7 @@
                     <pic:cNvPicPr/>
                   </pic:nvPicPr>
                   <pic:blipFill>
-                    <a:blip r:embed="rId13"/>
+                    <a:blip r:embed="rId11"/>
                     <a:stretch>
                       <a:fillRect/>
                     </a:stretch>
@@ -194,12 +155,24 @@
           <w:i/>
           <w:sz w:val="18"/>
         </w:rPr>
-        <w:t>Are you buying activation, or are you buying value? A 2x2 matrix crossing how often a seat gets opened against whether its output has been checked against an outcome: shelfware, the efficient specialist, token theater, and the real win.</w:t>
+        <w:t>Is AI seat usage tied to a checked outcome yet? A 2x2 matrix crossing how often a seat gets opened against whether its output has been checked against an outcome: early stage, efficient adopter, unverified volume, and verified value.</w:t>
       </w:r>
     </w:p>
     <w:p>
       <w:r>
-        <w:t>The two boxes that get discussed are the two boxes that create no confusion: shelfware is a budget conversation, and the real win is the case everyone is chasing. The two that actually decide how a firm spends its year are the quiet ones either side, the specialist whose light touch already works and never shows up as a success story, and the token theater box, which looks identical to the real win on every dashboard that only counts logins.</w:t>
+        <w:t>Growth in usage and growth in measured value are two different curves, and most license dashboards only show one of them. [YOUR DETAIL HERE] Economist Charles Goodhart's 1975 observation about monetary policy applies here too: once a number becomes the target, it tends to stop measuring what it originally measured (</w:t>
+      </w:r>
+      <w:hyperlink r:id="rId12">
+        <w:r>
+          <w:rPr>
+            <w:color w:val="0563C1"/>
+            <w:u w:val="single"/>
+          </w:rPr>
+          <w:t>Goodhart's law</w:t>
+        </w:r>
+      </w:hyperlink>
+      <w:r>
+        <w:t>). A firm that only watches logins or token counts can end up optimizing for whichever behavior produces more logins or tokens, which is not automatically the same behavior that produces better work. That is a reason to add a second measurement, not a verdict on the firms that have not added it yet.</w:t>
       </w:r>
     </w:p>
     <w:p>
@@ -218,7 +191,7 @@
     </w:p>
     <w:p>
       <w:r>
-        <w:t>A firm that measures the outcome instead of the login gets two different populations to learn from. The quiet majority who never opened the tool can be shown, concretely, what a Yenuga level user found worth the effort, rather than told in the abstract that AI helps. The heavy users stop being a cost line to manage down. They become a source of technique instead, since someone who ran a workflow enough times to cut their own token spend by 70 percent has already done the optimization work a firm would otherwise pay a consultant to redo.</w:t>
+        <w:t>A firm with a growth curve like Ropes &amp; Gray's has something concrete to study: which tasks its heaviest users gravitated toward, and what its internal champions were actually telling people. That is close to free research into what the tool is good for inside that specific firm, well ahead of a generic vendor claim.</w:t>
       </w:r>
     </w:p>
     <w:p>
@@ -232,12 +205,12 @@
           <w:color w:val="1F3A5F"/>
           <w:sz w:val="30"/>
         </w:rPr>
-        <w:t>The risk case</w:t>
+        <w:t>The open question</w:t>
       </w:r>
     </w:p>
     <w:p>
       <w:r>
-        <w:t>I hold this loosely, because the right amount of measurement depends on how mature the rollout already is. Watching outcomes instead of logins takes real infrastructure: a way to tie a specific AI assisted task to a specific deliverable's error rate or margin, and most firms have not built that yet. Build it too early or too heavily, and a firm can slow down a rollout that would have found its own value faster left alone. What I trust without much reservation is Maister's underlying claim, tested across decades of professional service firms: a metric that stops at activity, whether that activity is billable hours or token counts, keeps getting more activity and nothing else.</w:t>
+        <w:t>I hold this loosely. Most firms do not yet have a clean way to connect AI usage to project margin, error rate, or client outcome, and that is a fair place to be two years into a technology that is still changing quarter to quarter. Usage data is easy to produce because the billing system already generates it. Outcome data takes deliberate measurement on top of that. Microsoft's own finding, that organizational support matters more than individual effort, suggests the firms that add that measurement will see it pay off before the firms that only track logins do, not that the latter group did something wrong.</w:t>
       </w:r>
     </w:p>
     <w:p>
@@ -259,7 +232,7 @@
         <w:pStyle w:val="IntenseQuote"/>
       </w:pPr>
       <w:r>
-        <w:t>An opened seat and a better deliverable are two separate facts, and a firm that only tracks the first one is pricing AI the same way it priced the billable hour.</w:t>
+        <w:t>A rising number of logins or tokens is a fact about activity, and a firm still has to check separately whether it is also a fact about better work.</w:t>
       </w:r>
     </w:p>
     <w:p>
@@ -281,7 +254,7 @@
         <w:pStyle w:val="IntenseQuote"/>
       </w:pPr>
       <w:r>
-        <w:t>Prediction (2026-08-01): By the end of 2027, at least one major AEC or consulting firm will publicly report an AI adoption metric tied to project margin or rework rate, rather than seat activation or token volume alone. Confidence: medium.</w:t>
+        <w:t>Prediction (2026-08-01): By the end of 2027, at least one major professional services or AEC firm will publicly report an AI usage metric tied to project margin or error rate, alongside its login or token numbers rather than instead of them. Confidence: medium.</w:t>
       </w:r>
     </w:p>
     <w:p>
@@ -300,7 +273,7 @@
     </w:p>
     <w:p>
       <w:r>
-        <w:t>Whether any vendor sells a report built around hours saved or errors avoided instead of logins and tokens. That is currently the easiest number for Microsoft, Anthropic, and OpenAI to produce from their own billing systems, not necessarily the most useful one for a buyer. I am also watching whether firms start treating their heaviest AI users the way good firms already treat their most efficient timekeepers, as a source of technique to copy, rather than a number to explain in a budget meeting.</w:t>
+        <w:t>Whether more firms publish a growth curve like Ropes &amp; Gray's, and whether any of them also publish what happened to a margin or error rate number over the same two years. Right now the usage story is easy to find. The value story almost never gets published alongside it, which may say more about measurement maturity than about effort.</w:t>
       </w:r>
     </w:p>
     <w:sectPr>

</xml_diff>